<commit_message>
v2.6 some changes in database && modify the shipments to be assign again to the factory
</commit_message>
<xml_diff>
--- a/بعد التجربة -برنامج عم داود.docx
+++ b/بعد التجربة -برنامج عم داود.docx
@@ -956,10 +956,227 @@
     </w:p>
     <w:p>
       <w:pPr>
-        <w:pStyle w:val="ListParagraph"/>
-        <w:numPr>
-          <w:ilvl w:val="1"/>
-          <w:numId w:val="3"/>
+        <w:bidi/>
+        <w:rPr>
+          <w:rFonts w:ascii="Calibri" w:hAnsi="Calibri" w:cs="Calibri"/>
+          <w:rtl/>
+        </w:rPr>
+      </w:pPr>
+    </w:p>
+    <w:p>
+      <w:pPr>
+        <w:bidi/>
+        <w:rPr>
+          <w:rFonts w:ascii="Calibri" w:hAnsi="Calibri" w:cs="Calibri"/>
+          <w:rtl/>
+        </w:rPr>
+      </w:pPr>
+    </w:p>
+    <w:p>
+      <w:pPr>
+        <w:bidi/>
+        <w:rPr>
+          <w:rFonts w:ascii="Calibri" w:hAnsi="Calibri" w:cs="Calibri"/>
+          <w:rtl/>
+        </w:rPr>
+      </w:pPr>
+      <w:r>
+        <w:rPr>
+          <w:rFonts w:ascii="Calibri" w:hAnsi="Calibri" w:cs="Calibri"/>
+        </w:rPr>
+        <w:pict w14:anchorId="6FA0DD44">
+          <v:rect id="_x0000_i1027" style="width:0;height:1.5pt" o:hralign="center" o:hrstd="t" o:hr="t" fillcolor="#a0a0a0" stroked="f"/>
+        </w:pict>
+      </w:r>
+    </w:p>
+    <w:p>
+      <w:pPr>
+        <w:bidi/>
+        <w:rPr>
+          <w:rFonts w:ascii="Calibri" w:hAnsi="Calibri" w:cs="Calibri"/>
+          <w:rtl/>
+        </w:rPr>
+      </w:pPr>
+      <w:r>
+        <w:rPr>
+          <w:rFonts w:ascii="Calibri" w:hAnsi="Calibri" w:cs="Calibri" w:hint="cs"/>
+          <w:rtl/>
+        </w:rPr>
+        <w:t>تعديلات بعد تسل</w:t>
+      </w:r>
+      <w:r>
+        <w:rPr>
+          <w:rFonts w:ascii="Calibri" w:hAnsi="Calibri" w:cs="Calibri" w:hint="cs"/>
+          <w:rtl/>
+        </w:rPr>
+        <w:t>ي</w:t>
+      </w:r>
+      <w:r>
+        <w:rPr>
+          <w:rFonts w:ascii="Calibri" w:hAnsi="Calibri" w:cs="Calibri" w:hint="cs"/>
+          <w:rtl/>
+        </w:rPr>
+        <w:t>مي يوم الاربعاء 9/9:</w:t>
+      </w:r>
+    </w:p>
+    <w:p>
+      <w:pPr>
+        <w:pStyle w:val="ListParagraph"/>
+        <w:numPr>
+          <w:ilvl w:val="0"/>
+          <w:numId w:val="4"/>
+        </w:numPr>
+        <w:bidi/>
+        <w:rPr>
+          <w:rFonts w:ascii="Calibri" w:hAnsi="Calibri" w:cs="Calibri"/>
+        </w:rPr>
+      </w:pPr>
+      <w:r>
+        <w:rPr>
+          <w:rFonts w:ascii="Calibri" w:hAnsi="Calibri" w:cs="Calibri" w:hint="cs"/>
+          <w:rtl/>
+        </w:rPr>
+        <w:t xml:space="preserve">نسبة الخصم دائماً تبقي </w:t>
+      </w:r>
+      <w:r>
+        <w:rPr>
+          <w:rFonts w:ascii="Calibri" w:hAnsi="Calibri" w:cs="Calibri"/>
+        </w:rPr>
+        <w:t xml:space="preserve"> </w:t>
+      </w:r>
+      <w:r>
+        <w:rPr>
+          <w:rFonts w:ascii="Calibri" w:hAnsi="Calibri" w:cs="Calibri" w:hint="cs"/>
+          <w:rtl/>
+          <w:lang w:bidi="ar-EG"/>
+        </w:rPr>
+        <w:t>مئوية</w:t>
+      </w:r>
+    </w:p>
+    <w:p>
+      <w:pPr>
+        <w:pStyle w:val="ListParagraph"/>
+        <w:numPr>
+          <w:ilvl w:val="0"/>
+          <w:numId w:val="4"/>
+        </w:numPr>
+        <w:bidi/>
+        <w:rPr>
+          <w:rFonts w:ascii="Calibri" w:hAnsi="Calibri" w:cs="Calibri"/>
+        </w:rPr>
+      </w:pPr>
+      <w:r>
+        <w:rPr>
+          <w:rFonts w:ascii="Calibri" w:hAnsi="Calibri" w:cs="Calibri" w:hint="cs"/>
+          <w:rtl/>
+          <w:lang w:bidi="ar-EG"/>
+        </w:rPr>
+        <w:t>الشحنة مبقتش بتسمع في</w:t>
+      </w:r>
+      <w:r>
+        <w:rPr>
+          <w:rFonts w:ascii="Calibri" w:hAnsi="Calibri" w:cs="Calibri" w:hint="cs"/>
+          <w:rtl/>
+          <w:lang w:bidi="ar-EG"/>
+        </w:rPr>
+        <w:t xml:space="preserve"> حساب</w:t>
+      </w:r>
+      <w:r>
+        <w:rPr>
+          <w:rFonts w:ascii="Calibri" w:hAnsi="Calibri" w:cs="Calibri" w:hint="cs"/>
+          <w:rtl/>
+          <w:lang w:bidi="ar-EG"/>
+        </w:rPr>
+        <w:t xml:space="preserve"> المصنع</w:t>
+      </w:r>
+    </w:p>
+    <w:p>
+      <w:pPr>
+        <w:pStyle w:val="ListParagraph"/>
+        <w:numPr>
+          <w:ilvl w:val="0"/>
+          <w:numId w:val="4"/>
+        </w:numPr>
+        <w:bidi/>
+        <w:rPr>
+          <w:rFonts w:ascii="Calibri" w:hAnsi="Calibri" w:cs="Calibri"/>
+        </w:rPr>
+      </w:pPr>
+      <w:r>
+        <w:rPr>
+          <w:rFonts w:ascii="Calibri" w:hAnsi="Calibri" w:cs="Calibri" w:hint="cs"/>
+          <w:rtl/>
+        </w:rPr>
+        <w:t xml:space="preserve">عايزين نمسح دي </w:t>
+      </w:r>
+      <w:r>
+        <w:rPr>
+          <w:rFonts w:ascii="Calibri" w:hAnsi="Calibri" w:cs="Calibri"/>
+          <w:rtl/>
+        </w:rPr>
+        <w:drawing>
+          <wp:inline distT="0" distB="0" distL="0" distR="0" wp14:anchorId="4C33B866" wp14:editId="7736066E">
+            <wp:extent cx="3305636" cy="5010849"/>
+            <wp:effectExtent l="0" t="0" r="9525" b="0"/>
+            <wp:docPr id="1151336334" name="Picture 1"/>
+            <wp:cNvGraphicFramePr>
+              <a:graphicFrameLocks xmlns:a="http://schemas.openxmlformats.org/drawingml/2006/main" noChangeAspect="1"/>
+            </wp:cNvGraphicFramePr>
+            <a:graphic xmlns:a="http://schemas.openxmlformats.org/drawingml/2006/main">
+              <a:graphicData uri="http://schemas.openxmlformats.org/drawingml/2006/picture">
+                <pic:pic xmlns:pic="http://schemas.openxmlformats.org/drawingml/2006/picture">
+                  <pic:nvPicPr>
+                    <pic:cNvPr id="1151336334" name=""/>
+                    <pic:cNvPicPr/>
+                  </pic:nvPicPr>
+                  <pic:blipFill>
+                    <a:blip r:embed="rId8"/>
+                    <a:stretch>
+                      <a:fillRect/>
+                    </a:stretch>
+                  </pic:blipFill>
+                  <pic:spPr>
+                    <a:xfrm>
+                      <a:off x="0" y="0"/>
+                      <a:ext cx="3305636" cy="5010849"/>
+                    </a:xfrm>
+                    <a:prstGeom prst="rect">
+                      <a:avLst/>
+                    </a:prstGeom>
+                  </pic:spPr>
+                </pic:pic>
+              </a:graphicData>
+            </a:graphic>
+          </wp:inline>
+        </w:drawing>
+      </w:r>
+    </w:p>
+    <w:p>
+      <w:pPr>
+        <w:pStyle w:val="ListParagraph"/>
+        <w:numPr>
+          <w:ilvl w:val="0"/>
+          <w:numId w:val="4"/>
+        </w:numPr>
+        <w:bidi/>
+        <w:rPr>
+          <w:rFonts w:ascii="Calibri" w:hAnsi="Calibri" w:cs="Calibri"/>
+        </w:rPr>
+      </w:pPr>
+      <w:r>
+        <w:rPr>
+          <w:rFonts w:ascii="Calibri" w:hAnsi="Calibri" w:cs="Calibri" w:hint="cs"/>
+          <w:rtl/>
+        </w:rPr>
+        <w:t>موردين المخازن ميظهروش في ثائمة الموردين اللي بتظهر و انا بختار المورد اللي هيعمل شحنة</w:t>
+      </w:r>
+    </w:p>
+    <w:p>
+      <w:pPr>
+        <w:pStyle w:val="ListParagraph"/>
+        <w:numPr>
+          <w:ilvl w:val="0"/>
+          <w:numId w:val="4"/>
         </w:numPr>
         <w:bidi/>
         <w:rPr>
@@ -1240,6 +1457,119 @@
       </w:pPr>
     </w:lvl>
   </w:abstractNum>
+  <w:abstractNum w:abstractNumId="3" w15:restartNumberingAfterBreak="0">
+    <w:nsid w:val="58796012"/>
+    <w:multiLevelType w:val="hybridMultilevel"/>
+    <w:tmpl w:val="B3927E30"/>
+    <w:lvl w:ilvl="0" w:tplc="08090001">
+      <w:start w:val="1"/>
+      <w:numFmt w:val="bullet"/>
+      <w:lvlText w:val=""/>
+      <w:lvlJc w:val="left"/>
+      <w:pPr>
+        <w:ind w:left="1444" w:hanging="360"/>
+      </w:pPr>
+      <w:rPr>
+        <w:rFonts w:ascii="Symbol" w:hAnsi="Symbol" w:hint="default"/>
+      </w:rPr>
+    </w:lvl>
+    <w:lvl w:ilvl="1" w:tplc="08090003" w:tentative="1">
+      <w:start w:val="1"/>
+      <w:numFmt w:val="bullet"/>
+      <w:lvlText w:val="o"/>
+      <w:lvlJc w:val="left"/>
+      <w:pPr>
+        <w:ind w:left="2164" w:hanging="360"/>
+      </w:pPr>
+      <w:rPr>
+        <w:rFonts w:ascii="Courier New" w:hAnsi="Courier New" w:cs="Courier New" w:hint="default"/>
+      </w:rPr>
+    </w:lvl>
+    <w:lvl w:ilvl="2" w:tplc="08090005" w:tentative="1">
+      <w:start w:val="1"/>
+      <w:numFmt w:val="bullet"/>
+      <w:lvlText w:val=""/>
+      <w:lvlJc w:val="left"/>
+      <w:pPr>
+        <w:ind w:left="2884" w:hanging="360"/>
+      </w:pPr>
+      <w:rPr>
+        <w:rFonts w:ascii="Wingdings" w:hAnsi="Wingdings" w:hint="default"/>
+      </w:rPr>
+    </w:lvl>
+    <w:lvl w:ilvl="3" w:tplc="08090001" w:tentative="1">
+      <w:start w:val="1"/>
+      <w:numFmt w:val="bullet"/>
+      <w:lvlText w:val=""/>
+      <w:lvlJc w:val="left"/>
+      <w:pPr>
+        <w:ind w:left="3604" w:hanging="360"/>
+      </w:pPr>
+      <w:rPr>
+        <w:rFonts w:ascii="Symbol" w:hAnsi="Symbol" w:hint="default"/>
+      </w:rPr>
+    </w:lvl>
+    <w:lvl w:ilvl="4" w:tplc="08090003" w:tentative="1">
+      <w:start w:val="1"/>
+      <w:numFmt w:val="bullet"/>
+      <w:lvlText w:val="o"/>
+      <w:lvlJc w:val="left"/>
+      <w:pPr>
+        <w:ind w:left="4324" w:hanging="360"/>
+      </w:pPr>
+      <w:rPr>
+        <w:rFonts w:ascii="Courier New" w:hAnsi="Courier New" w:cs="Courier New" w:hint="default"/>
+      </w:rPr>
+    </w:lvl>
+    <w:lvl w:ilvl="5" w:tplc="08090005" w:tentative="1">
+      <w:start w:val="1"/>
+      <w:numFmt w:val="bullet"/>
+      <w:lvlText w:val=""/>
+      <w:lvlJc w:val="left"/>
+      <w:pPr>
+        <w:ind w:left="5044" w:hanging="360"/>
+      </w:pPr>
+      <w:rPr>
+        <w:rFonts w:ascii="Wingdings" w:hAnsi="Wingdings" w:hint="default"/>
+      </w:rPr>
+    </w:lvl>
+    <w:lvl w:ilvl="6" w:tplc="08090001" w:tentative="1">
+      <w:start w:val="1"/>
+      <w:numFmt w:val="bullet"/>
+      <w:lvlText w:val=""/>
+      <w:lvlJc w:val="left"/>
+      <w:pPr>
+        <w:ind w:left="5764" w:hanging="360"/>
+      </w:pPr>
+      <w:rPr>
+        <w:rFonts w:ascii="Symbol" w:hAnsi="Symbol" w:hint="default"/>
+      </w:rPr>
+    </w:lvl>
+    <w:lvl w:ilvl="7" w:tplc="08090003" w:tentative="1">
+      <w:start w:val="1"/>
+      <w:numFmt w:val="bullet"/>
+      <w:lvlText w:val="o"/>
+      <w:lvlJc w:val="left"/>
+      <w:pPr>
+        <w:ind w:left="6484" w:hanging="360"/>
+      </w:pPr>
+      <w:rPr>
+        <w:rFonts w:ascii="Courier New" w:hAnsi="Courier New" w:cs="Courier New" w:hint="default"/>
+      </w:rPr>
+    </w:lvl>
+    <w:lvl w:ilvl="8" w:tplc="08090005" w:tentative="1">
+      <w:start w:val="1"/>
+      <w:numFmt w:val="bullet"/>
+      <w:lvlText w:val=""/>
+      <w:lvlJc w:val="left"/>
+      <w:pPr>
+        <w:ind w:left="7204" w:hanging="360"/>
+      </w:pPr>
+      <w:rPr>
+        <w:rFonts w:ascii="Wingdings" w:hAnsi="Wingdings" w:hint="default"/>
+      </w:rPr>
+    </w:lvl>
+  </w:abstractNum>
   <w:num w:numId="1" w16cid:durableId="150878395">
     <w:abstractNumId w:val="0"/>
   </w:num>
@@ -1248,6 +1578,9 @@
   </w:num>
   <w:num w:numId="3" w16cid:durableId="2016809449">
     <w:abstractNumId w:val="2"/>
+  </w:num>
+  <w:num w:numId="4" w16cid:durableId="747582859">
+    <w:abstractNumId w:val="3"/>
   </w:num>
 </w:numbering>
 </file>

</xml_diff>

<commit_message>
v2.7 - deduction by percentage in all screens
</commit_message>
<xml_diff>
--- a/بعد التجربة -برنامج عم داود.docx
+++ b/بعد التجربة -برنامج عم داود.docx
@@ -1031,27 +1031,6 @@
           <w:rFonts w:ascii="Calibri" w:hAnsi="Calibri" w:cs="Calibri"/>
         </w:rPr>
       </w:pPr>
-      <w:r>
-        <w:rPr>
-          <w:rFonts w:ascii="Calibri" w:hAnsi="Calibri" w:cs="Calibri" w:hint="cs"/>
-          <w:rtl/>
-        </w:rPr>
-        <w:t xml:space="preserve">نسبة الخصم دائماً تبقي </w:t>
-      </w:r>
-      <w:r>
-        <w:rPr>
-          <w:rFonts w:ascii="Calibri" w:hAnsi="Calibri" w:cs="Calibri"/>
-        </w:rPr>
-        <w:t xml:space="preserve"> </w:t>
-      </w:r>
-      <w:r>
-        <w:rPr>
-          <w:rFonts w:ascii="Calibri" w:hAnsi="Calibri" w:cs="Calibri" w:hint="cs"/>
-          <w:rtl/>
-          <w:lang w:bidi="ar-EG"/>
-        </w:rPr>
-        <w:t>مئوية</w:t>
-      </w:r>
     </w:p>
     <w:p>
       <w:pPr>
@@ -1112,6 +1091,7 @@
       <w:r>
         <w:rPr>
           <w:rFonts w:ascii="Calibri" w:hAnsi="Calibri" w:cs="Calibri"/>
+          <w:noProof/>
           <w:rtl/>
         </w:rPr>
         <w:drawing>

</xml_diff>

<commit_message>
adjust the display in the factory detail history for recieving the shipments
</commit_message>
<xml_diff>
--- a/بعد التجربة -برنامج عم داود.docx
+++ b/بعد التجربة -برنامج عم داود.docx
@@ -555,69 +555,6 @@
       <w:pPr>
         <w:pStyle w:val="ListParagraph"/>
         <w:numPr>
-          <w:ilvl w:val="1"/>
-          <w:numId w:val="2"/>
-        </w:numPr>
-        <w:bidi/>
-        <w:rPr>
-          <w:rFonts w:ascii="Calibri" w:hAnsi="Calibri" w:cs="Calibri"/>
-        </w:rPr>
-      </w:pPr>
-      <w:r>
-        <w:rPr>
-          <w:rFonts w:ascii="Calibri" w:hAnsi="Calibri" w:cs="Calibri"/>
-          <w:noProof/>
-          <w:rtl/>
-        </w:rPr>
-        <w:lastRenderedPageBreak/>
-        <w:drawing>
-          <wp:inline distT="0" distB="0" distL="0" distR="0" wp14:anchorId="77C45082" wp14:editId="65345C08">
-            <wp:extent cx="5731510" cy="3009265"/>
-            <wp:effectExtent l="0" t="0" r="2540" b="635"/>
-            <wp:docPr id="903838412" name="Picture 1"/>
-            <wp:cNvGraphicFramePr>
-              <a:graphicFrameLocks xmlns:a="http://schemas.openxmlformats.org/drawingml/2006/main" noChangeAspect="1"/>
-            </wp:cNvGraphicFramePr>
-            <a:graphic xmlns:a="http://schemas.openxmlformats.org/drawingml/2006/main">
-              <a:graphicData uri="http://schemas.openxmlformats.org/drawingml/2006/picture">
-                <pic:pic xmlns:pic="http://schemas.openxmlformats.org/drawingml/2006/picture">
-                  <pic:nvPicPr>
-                    <pic:cNvPr id="903838412" name=""/>
-                    <pic:cNvPicPr/>
-                  </pic:nvPicPr>
-                  <pic:blipFill>
-                    <a:blip r:embed="rId6"/>
-                    <a:stretch>
-                      <a:fillRect/>
-                    </a:stretch>
-                  </pic:blipFill>
-                  <pic:spPr>
-                    <a:xfrm>
-                      <a:off x="0" y="0"/>
-                      <a:ext cx="5731510" cy="3009265"/>
-                    </a:xfrm>
-                    <a:prstGeom prst="rect">
-                      <a:avLst/>
-                    </a:prstGeom>
-                  </pic:spPr>
-                </pic:pic>
-              </a:graphicData>
-            </a:graphic>
-          </wp:inline>
-        </w:drawing>
-      </w:r>
-      <w:r>
-        <w:rPr>
-          <w:rFonts w:ascii="Calibri" w:hAnsi="Calibri" w:cs="Calibri" w:hint="cs"/>
-          <w:rtl/>
-        </w:rPr>
-        <w:t xml:space="preserve">هنا مفروض يعرض قائمة الموردين الكبار اللي مش مربوطين بمخزن </w:t>
-      </w:r>
-    </w:p>
-    <w:p>
-      <w:pPr>
-        <w:pStyle w:val="ListParagraph"/>
-        <w:numPr>
           <w:ilvl w:val="0"/>
           <w:numId w:val="2"/>
         </w:numPr>
@@ -663,123 +600,6 @@
     </w:p>
     <w:p>
       <w:pPr>
-        <w:pStyle w:val="ListParagraph"/>
-        <w:numPr>
-          <w:ilvl w:val="0"/>
-          <w:numId w:val="2"/>
-        </w:numPr>
-        <w:bidi/>
-        <w:rPr>
-          <w:rFonts w:ascii="Calibri" w:hAnsi="Calibri" w:cs="Calibri"/>
-        </w:rPr>
-      </w:pPr>
-      <w:r>
-        <w:rPr>
-          <w:rFonts w:ascii="Calibri" w:hAnsi="Calibri" w:cs="Calibri" w:hint="cs"/>
-          <w:rtl/>
-        </w:rPr>
-        <w:t>تعديل</w:t>
-      </w:r>
-      <w:r>
-        <w:rPr>
-          <w:rFonts w:ascii="Calibri" w:hAnsi="Calibri" w:cs="Calibri" w:hint="cs"/>
-          <w:rtl/>
-        </w:rPr>
-        <w:t xml:space="preserve"> في الموردين </w:t>
-      </w:r>
-      <w:r>
-        <w:rPr>
-          <w:rFonts w:ascii="Calibri" w:hAnsi="Calibri" w:cs="Calibri"/>
-          <w:noProof/>
-          <w:rtl/>
-        </w:rPr>
-        <w:drawing>
-          <wp:inline distT="0" distB="0" distL="0" distR="0" wp14:anchorId="0A2BFB0E" wp14:editId="235B1CE6">
-            <wp:extent cx="5731510" cy="3009265"/>
-            <wp:effectExtent l="0" t="0" r="2540" b="635"/>
-            <wp:docPr id="890256171" name="Picture 1"/>
-            <wp:cNvGraphicFramePr>
-              <a:graphicFrameLocks xmlns:a="http://schemas.openxmlformats.org/drawingml/2006/main" noChangeAspect="1"/>
-            </wp:cNvGraphicFramePr>
-            <a:graphic xmlns:a="http://schemas.openxmlformats.org/drawingml/2006/main">
-              <a:graphicData uri="http://schemas.openxmlformats.org/drawingml/2006/picture">
-                <pic:pic xmlns:pic="http://schemas.openxmlformats.org/drawingml/2006/picture">
-                  <pic:nvPicPr>
-                    <pic:cNvPr id="890256171" name=""/>
-                    <pic:cNvPicPr/>
-                  </pic:nvPicPr>
-                  <pic:blipFill>
-                    <a:blip r:embed="rId7"/>
-                    <a:stretch>
-                      <a:fillRect/>
-                    </a:stretch>
-                  </pic:blipFill>
-                  <pic:spPr>
-                    <a:xfrm>
-                      <a:off x="0" y="0"/>
-                      <a:ext cx="5731510" cy="3009265"/>
-                    </a:xfrm>
-                    <a:prstGeom prst="rect">
-                      <a:avLst/>
-                    </a:prstGeom>
-                  </pic:spPr>
-                </pic:pic>
-              </a:graphicData>
-            </a:graphic>
-          </wp:inline>
-        </w:drawing>
-      </w:r>
-      <w:r>
-        <w:rPr>
-          <w:rFonts w:ascii="Calibri" w:hAnsi="Calibri" w:cs="Calibri" w:hint="cs"/>
-          <w:rtl/>
-        </w:rPr>
-        <w:t xml:space="preserve"> مفروض هنا عايز اشوف مين تبع مخزن</w:t>
-      </w:r>
-      <w:r>
-        <w:rPr>
-          <w:rFonts w:ascii="Calibri" w:hAnsi="Calibri" w:cs="Calibri" w:hint="cs"/>
-          <w:rtl/>
-        </w:rPr>
-        <w:t xml:space="preserve"> و مخزن ايه</w:t>
-      </w:r>
-      <w:r>
-        <w:rPr>
-          <w:rFonts w:ascii="Calibri" w:hAnsi="Calibri" w:cs="Calibri" w:hint="cs"/>
-          <w:rtl/>
-        </w:rPr>
-        <w:t xml:space="preserve"> و مين تبع عادي (يعني جدول و معموله فلتر بيظهر جنب اسم كل مور</w:t>
-      </w:r>
-      <w:r>
-        <w:rPr>
-          <w:rFonts w:ascii="Calibri" w:hAnsi="Calibri" w:cs="Calibri" w:hint="cs"/>
-          <w:rtl/>
-        </w:rPr>
-        <w:t>د)</w:t>
-      </w:r>
-    </w:p>
-    <w:p>
-      <w:pPr>
-        <w:pStyle w:val="ListParagraph"/>
-        <w:numPr>
-          <w:ilvl w:val="0"/>
-          <w:numId w:val="2"/>
-        </w:numPr>
-        <w:bidi/>
-        <w:rPr>
-          <w:rFonts w:ascii="Calibri" w:hAnsi="Calibri" w:cs="Calibri"/>
-        </w:rPr>
-      </w:pPr>
-      <w:r>
-        <w:rPr>
-          <w:rFonts w:ascii="Calibri" w:hAnsi="Calibri" w:cs="Calibri" w:hint="cs"/>
-          <w:rtl/>
-        </w:rPr>
-        <w:t>ء</w:t>
-      </w:r>
-    </w:p>
-    <w:p>
-      <w:pPr>
         <w:bidi/>
         <w:rPr>
           <w:rFonts w:ascii="Calibri" w:hAnsi="Calibri" w:cs="Calibri"/>
@@ -855,7 +675,6 @@
           <w:rFonts w:ascii="Calibri" w:hAnsi="Calibri" w:cs="Calibri" w:hint="cs"/>
           <w:rtl/>
         </w:rPr>
-        <w:lastRenderedPageBreak/>
         <w:t xml:space="preserve">دلوقتي </w:t>
       </w:r>
       <w:r>
@@ -994,7 +813,6 @@
         <w:bidi/>
         <w:rPr>
           <w:rFonts w:ascii="Calibri" w:hAnsi="Calibri" w:cs="Calibri"/>
-          <w:rtl/>
         </w:rPr>
       </w:pPr>
       <w:r>
@@ -1018,151 +836,6 @@
         </w:rPr>
         <w:t>مي يوم الاربعاء 9/9:</w:t>
       </w:r>
-    </w:p>
-    <w:p>
-      <w:pPr>
-        <w:pStyle w:val="ListParagraph"/>
-        <w:numPr>
-          <w:ilvl w:val="0"/>
-          <w:numId w:val="4"/>
-        </w:numPr>
-        <w:bidi/>
-        <w:rPr>
-          <w:rFonts w:ascii="Calibri" w:hAnsi="Calibri" w:cs="Calibri"/>
-        </w:rPr>
-      </w:pPr>
-    </w:p>
-    <w:p>
-      <w:pPr>
-        <w:pStyle w:val="ListParagraph"/>
-        <w:numPr>
-          <w:ilvl w:val="0"/>
-          <w:numId w:val="4"/>
-        </w:numPr>
-        <w:bidi/>
-        <w:rPr>
-          <w:rFonts w:ascii="Calibri" w:hAnsi="Calibri" w:cs="Calibri"/>
-        </w:rPr>
-      </w:pPr>
-      <w:r>
-        <w:rPr>
-          <w:rFonts w:ascii="Calibri" w:hAnsi="Calibri" w:cs="Calibri" w:hint="cs"/>
-          <w:rtl/>
-          <w:lang w:bidi="ar-EG"/>
-        </w:rPr>
-        <w:t>الشحنة مبقتش بتسمع في</w:t>
-      </w:r>
-      <w:r>
-        <w:rPr>
-          <w:rFonts w:ascii="Calibri" w:hAnsi="Calibri" w:cs="Calibri" w:hint="cs"/>
-          <w:rtl/>
-          <w:lang w:bidi="ar-EG"/>
-        </w:rPr>
-        <w:t xml:space="preserve"> حساب</w:t>
-      </w:r>
-      <w:r>
-        <w:rPr>
-          <w:rFonts w:ascii="Calibri" w:hAnsi="Calibri" w:cs="Calibri" w:hint="cs"/>
-          <w:rtl/>
-          <w:lang w:bidi="ar-EG"/>
-        </w:rPr>
-        <w:t xml:space="preserve"> المصنع</w:t>
-      </w:r>
-    </w:p>
-    <w:p>
-      <w:pPr>
-        <w:pStyle w:val="ListParagraph"/>
-        <w:numPr>
-          <w:ilvl w:val="0"/>
-          <w:numId w:val="4"/>
-        </w:numPr>
-        <w:bidi/>
-        <w:rPr>
-          <w:rFonts w:ascii="Calibri" w:hAnsi="Calibri" w:cs="Calibri"/>
-        </w:rPr>
-      </w:pPr>
-      <w:r>
-        <w:rPr>
-          <w:rFonts w:ascii="Calibri" w:hAnsi="Calibri" w:cs="Calibri" w:hint="cs"/>
-          <w:rtl/>
-        </w:rPr>
-        <w:t xml:space="preserve">عايزين نمسح دي </w:t>
-      </w:r>
-      <w:r>
-        <w:rPr>
-          <w:rFonts w:ascii="Calibri" w:hAnsi="Calibri" w:cs="Calibri"/>
-          <w:noProof/>
-          <w:rtl/>
-        </w:rPr>
-        <w:drawing>
-          <wp:inline distT="0" distB="0" distL="0" distR="0" wp14:anchorId="4C33B866" wp14:editId="7736066E">
-            <wp:extent cx="3305636" cy="5010849"/>
-            <wp:effectExtent l="0" t="0" r="9525" b="0"/>
-            <wp:docPr id="1151336334" name="Picture 1"/>
-            <wp:cNvGraphicFramePr>
-              <a:graphicFrameLocks xmlns:a="http://schemas.openxmlformats.org/drawingml/2006/main" noChangeAspect="1"/>
-            </wp:cNvGraphicFramePr>
-            <a:graphic xmlns:a="http://schemas.openxmlformats.org/drawingml/2006/main">
-              <a:graphicData uri="http://schemas.openxmlformats.org/drawingml/2006/picture">
-                <pic:pic xmlns:pic="http://schemas.openxmlformats.org/drawingml/2006/picture">
-                  <pic:nvPicPr>
-                    <pic:cNvPr id="1151336334" name=""/>
-                    <pic:cNvPicPr/>
-                  </pic:nvPicPr>
-                  <pic:blipFill>
-                    <a:blip r:embed="rId8"/>
-                    <a:stretch>
-                      <a:fillRect/>
-                    </a:stretch>
-                  </pic:blipFill>
-                  <pic:spPr>
-                    <a:xfrm>
-                      <a:off x="0" y="0"/>
-                      <a:ext cx="3305636" cy="5010849"/>
-                    </a:xfrm>
-                    <a:prstGeom prst="rect">
-                      <a:avLst/>
-                    </a:prstGeom>
-                  </pic:spPr>
-                </pic:pic>
-              </a:graphicData>
-            </a:graphic>
-          </wp:inline>
-        </w:drawing>
-      </w:r>
-    </w:p>
-    <w:p>
-      <w:pPr>
-        <w:pStyle w:val="ListParagraph"/>
-        <w:numPr>
-          <w:ilvl w:val="0"/>
-          <w:numId w:val="4"/>
-        </w:numPr>
-        <w:bidi/>
-        <w:rPr>
-          <w:rFonts w:ascii="Calibri" w:hAnsi="Calibri" w:cs="Calibri"/>
-        </w:rPr>
-      </w:pPr>
-      <w:r>
-        <w:rPr>
-          <w:rFonts w:ascii="Calibri" w:hAnsi="Calibri" w:cs="Calibri" w:hint="cs"/>
-          <w:rtl/>
-        </w:rPr>
-        <w:t>موردين المخازن ميظهروش في ثائمة الموردين اللي بتظهر و انا بختار المورد اللي هيعمل شحنة</w:t>
-      </w:r>
-    </w:p>
-    <w:p>
-      <w:pPr>
-        <w:pStyle w:val="ListParagraph"/>
-        <w:numPr>
-          <w:ilvl w:val="0"/>
-          <w:numId w:val="4"/>
-        </w:numPr>
-        <w:bidi/>
-        <w:rPr>
-          <w:rFonts w:ascii="Calibri" w:hAnsi="Calibri" w:cs="Calibri"/>
-        </w:rPr>
-      </w:pPr>
     </w:p>
     <w:sectPr>
       <w:pgSz w:w="11906" w:h="16838"/>

</xml_diff>

<commit_message>
last upadates with new features
</commit_message>
<xml_diff>
--- a/بعد التجربة -برنامج عم داود.docx
+++ b/بعد التجربة -برنامج عم داود.docx
@@ -214,6 +214,55 @@
         </w:rPr>
         <w:t xml:space="preserve"> ما عدا الشحنات</w:t>
       </w:r>
+    </w:p>
+    <w:p>
+      <w:pPr>
+        <w:pStyle w:val="ListParagraph"/>
+        <w:numPr>
+          <w:ilvl w:val="0"/>
+          <w:numId w:val="1"/>
+        </w:numPr>
+        <w:bidi/>
+        <w:rPr>
+          <w:rFonts w:ascii="Calibri" w:hAnsi="Calibri" w:cs="Calibri"/>
+        </w:rPr>
+      </w:pPr>
+      <w:r>
+        <w:rPr>
+          <w:rFonts w:ascii="Calibri" w:hAnsi="Calibri" w:cs="Calibri" w:hint="cs"/>
+          <w:rtl/>
+          <w:lang w:bidi="ar-EG"/>
+        </w:rPr>
+        <w:t xml:space="preserve">كل مورد يكون له </w:t>
+      </w:r>
+      <w:r>
+        <w:rPr>
+          <w:rFonts w:ascii="Calibri" w:hAnsi="Calibri" w:cs="Calibri"/>
+          <w:lang w:bidi="ar-EG"/>
+        </w:rPr>
+        <w:t xml:space="preserve">ID </w:t>
+      </w:r>
+      <w:r>
+        <w:rPr>
+          <w:rFonts w:ascii="Calibri" w:hAnsi="Calibri" w:cs="Calibri" w:hint="cs"/>
+          <w:rtl/>
+          <w:lang w:bidi="ar-EG"/>
+        </w:rPr>
+        <w:t>بيظهر بيه ، و كمان يكون بالترتيب</w:t>
+      </w:r>
+    </w:p>
+    <w:p>
+      <w:pPr>
+        <w:pStyle w:val="ListParagraph"/>
+        <w:numPr>
+          <w:ilvl w:val="0"/>
+          <w:numId w:val="1"/>
+        </w:numPr>
+        <w:bidi/>
+        <w:rPr>
+          <w:rFonts w:ascii="Calibri" w:hAnsi="Calibri" w:cs="Calibri"/>
+        </w:rPr>
+      </w:pPr>
     </w:p>
     <w:p>
       <w:pPr>
@@ -750,6 +799,7 @@
           <w:rFonts w:ascii="Calibri" w:hAnsi="Calibri" w:cs="Calibri" w:hint="cs"/>
           <w:rtl/>
         </w:rPr>
+        <w:lastRenderedPageBreak/>
         <w:t>مصروفات بقي عامة للشركة :</w:t>
       </w:r>
     </w:p>

</xml_diff>